<commit_message>
Corrige las listas del Informe Administrativo: párrafos reales, no saltos manuales
Las 6 listas (días, indicios, subsunción, conclusiones, recomendaciones,
anexos) ahora se arman como arrays de {texto} y se renderizan con el loop
de párrafo de docxtemplater (paragraphLoop:true), un párrafo real de Word
por ítem con su propia sangría francesa (27.35pt/-12.95pt), igual que la
sección III. Antes se unían con "\n" dentro de un solo párrafo, lo que solo
aplicaba la sangría colgante a la primera línea real.

Co-Authored-By: Claude Sonnet 5 <noreply@anthropic.com>
</commit_message>
<xml_diff>
--- a/plantillas/plantilla_informe_administrativo.docx
+++ b/plantillas/plantilla_informe_administrativo.docx
@@ -182,8 +182,14 @@
       </w:r>
     </w:p>
     <w:p>
+      <w:r>
+        <w:t>{#dias}</w:t>
+      </w:r>
+    </w:p>
+    <w:p>
       <w:pPr>
-        <w:ind w:left="403"/>
+        <w:spacing w:after="60" w:line="252" w:lineRule="auto"/>
+        <w:ind w:left="547" w:hanging="259"/>
         <w:rPr>
           <w:rFonts w:cs="Arial"/>
           <w:sz w:val="24"/>
@@ -198,7 +204,12 @@
           <w:szCs w:val="24"/>
           <w:lang w:val="es-PE"/>
         </w:rPr>
-        <w:t xml:space="preserve">{descripcion_dias}</w:t>
+        <w:t xml:space="preserve">{texto}</w:t>
+      </w:r>
+    </w:p>
+    <w:p>
+      <w:r>
+        <w:t>{/dias}</w:t>
       </w:r>
     </w:p>
     <w:p>
@@ -386,9 +397,14 @@
       </w:r>
     </w:p>
     <w:p>
+      <w:r>
+        <w:t>{#indicios}</w:t>
+      </w:r>
+    </w:p>
+    <w:p>
       <w:pPr>
         <w:spacing w:after="60" w:line="252" w:lineRule="auto"/>
-        <w:ind w:left="547"/>
+        <w:ind w:left="547" w:hanging="259"/>
         <w:rPr>
           <w:rFonts w:cs="Arial"/>
           <w:sz w:val="24"/>
@@ -403,7 +419,12 @@
           <w:szCs w:val="24"/>
           <w:lang w:val="es-PE"/>
         </w:rPr>
-        <w:t xml:space="preserve">{indicios_lista}</w:t>
+        <w:t xml:space="preserve">{texto}</w:t>
+      </w:r>
+    </w:p>
+    <w:p>
+      <w:r>
+        <w:t>{/indicios}</w:t>
       </w:r>
     </w:p>
     <w:p>
@@ -467,9 +488,14 @@
       </w:r>
     </w:p>
     <w:p>
+      <w:r>
+        <w:t>{#subsuncion}</w:t>
+      </w:r>
+    </w:p>
+    <w:p>
       <w:pPr>
         <w:spacing w:after="60" w:line="252" w:lineRule="auto"/>
-        <w:ind w:left="547"/>
+        <w:ind w:left="547" w:hanging="259"/>
         <w:rPr>
           <w:rFonts w:cs="Arial"/>
           <w:sz w:val="24"/>
@@ -484,7 +510,12 @@
           <w:szCs w:val="24"/>
           <w:lang w:val="es-PE"/>
         </w:rPr>
-        <w:t xml:space="preserve">{subsuncion_lista}</w:t>
+        <w:t xml:space="preserve">{texto}</w:t>
+      </w:r>
+    </w:p>
+    <w:p>
+      <w:r>
+        <w:t>{/subsuncion}</w:t>
       </w:r>
     </w:p>
     <w:p>
@@ -509,9 +540,14 @@
       </w:r>
     </w:p>
     <w:p>
+      <w:r>
+        <w:t>{#conclusiones}</w:t>
+      </w:r>
+    </w:p>
+    <w:p>
       <w:pPr>
         <w:spacing w:after="80" w:line="257" w:lineRule="auto"/>
-        <w:ind w:left="547"/>
+        <w:ind w:left="547" w:hanging="259"/>
         <w:rPr>
           <w:rFonts w:cs="Arial"/>
           <w:sz w:val="24"/>
@@ -526,7 +562,12 @@
           <w:szCs w:val="24"/>
           <w:lang w:val="es-PE"/>
         </w:rPr>
-        <w:t xml:space="preserve">{conclusiones_lista}</w:t>
+        <w:t xml:space="preserve">{texto}</w:t>
+      </w:r>
+    </w:p>
+    <w:p>
+      <w:r>
+        <w:t>{/conclusiones}</w:t>
       </w:r>
     </w:p>
     <w:p>
@@ -550,9 +591,14 @@
       </w:r>
     </w:p>
     <w:p>
+      <w:r>
+        <w:t>{#recomendaciones}</w:t>
+      </w:r>
+    </w:p>
+    <w:p>
       <w:pPr>
         <w:spacing w:after="80" w:line="257" w:lineRule="auto"/>
-        <w:ind w:left="547"/>
+        <w:ind w:left="547" w:hanging="259"/>
         <w:rPr>
           <w:rFonts w:cs="Arial"/>
           <w:sz w:val="24"/>
@@ -567,7 +613,12 @@
           <w:szCs w:val="24"/>
           <w:lang w:val="es-PE"/>
         </w:rPr>
-        <w:t xml:space="preserve">{recomendaciones_lista}</w:t>
+        <w:t xml:space="preserve">{texto}</w:t>
+      </w:r>
+    </w:p>
+    <w:p>
+      <w:r>
+        <w:t>{/recomendaciones}</w:t>
       </w:r>
     </w:p>
     <w:p>
@@ -591,9 +642,14 @@
       </w:r>
     </w:p>
     <w:p>
+      <w:r>
+        <w:t>{#anexos}</w:t>
+      </w:r>
+    </w:p>
+    <w:p>
       <w:pPr>
         <w:spacing w:after="80" w:line="257" w:lineRule="auto"/>
-        <w:ind w:left="547"/>
+        <w:ind w:left="547" w:hanging="259"/>
         <w:rPr>
           <w:rFonts w:cs="Arial"/>
           <w:sz w:val="24"/>
@@ -608,7 +664,12 @@
           <w:szCs w:val="24"/>
           <w:lang w:val="es-PE"/>
         </w:rPr>
-        <w:t xml:space="preserve">{anexos_lista}</w:t>
+        <w:t xml:space="preserve">{texto}</w:t>
+      </w:r>
+    </w:p>
+    <w:p>
+      <w:r>
+        <w:t>{/anexos}</w:t>
       </w:r>
     </w:p>
     <w:p>

</xml_diff>